<commit_message>
IET package: single-blind wording, abstract 196w, 7 keywords, page numbers, UK spelling
</commit_message>
<xml_diff>
--- a/IET_Communications_Submission/01_Manuscript_IET_Communications.docx
+++ b/IET_Communications_Submission/01_Manuscript_IET_Communications.docx
@@ -743,6 +743,7 @@
     <w:p>
       <w:pPr>
         <w:sectPr>
+          <w:footerReference w:type="default" r:id="rId24"/>
           <w:pgSz w:w="11906" w:h="16838" w:orient="portrait"/>
           <w:pgMar w:top="0" w:right="0" w:bottom="0" w:left="0" w:header="708" w:footer="708" w:gutter="0"/>
           <w:pgNumType/>
@@ -780,7 +781,7 @@
           <w:sz w:val="24"/>
           <w:szCs w:val="24"/>
         </w:rPr>
-        <w:t xml:space="preserve">Machine learning (ML) is now central to published radio-link authentication research — and simultaneously the adversary’s standard toolkit. This scoping review classifies a verified corpus of 130 curated studies (2020–2026): a 121-study core on ML for wireless-link security or attacks on it — 84 defense, 30 threat, and 7 dual attack-plus-defense studies — plus 9 post-quantum-cryptography (PQC) contextual studies kept in a separate stratum. The corpus is assembled from a seeded expert path, two OpenAlex database runs, and a programmatic extension pool; it is a structured, English-language, tripath sample, not a census, and every record carries a resolvable identifier. Each study is coded on six fields — security function, AI method family, track, primary data source, validation practice, and readiness (R1–R5) — by a single coder and independently validated by a second author, so every comparative quantity reported below is a descriptive statistic for this sample.</w:t>
+        <w:t>Machine learning (ML) is now central to published radio-link authentication research — and simultaneously the adversary’s standard toolkit. This scoping review classifies 130 curated studies (2020–2026): a 121-study core on ML for wireless-link security or attacks on it (84 defense, 30 threat, 7 dual attack-plus-defense), plus 9 post-quantum-cryptography studies in a separate stratum. Each study is coded on six fields — security function, AI method, track, data source, validation practice, and readiness (R1–R5) — by a single coder and independently validated by a second author.</w:t>
       </w:r>
     </w:p>
     <w:p>
@@ -795,7 +796,7 @@
           <w:sz w:val="24"/>
           <w:szCs w:val="24"/>
         </w:rPr>
-        <w:t xml:space="preserve">Three descriptive patterns hold. First, validation practice splits by kind: 16 of 30 threat studies demonstrate on testbeds or over the air, while simulation-only and standard-split evaluations carry much of the defense mass; closed-loop evaluation (defined in §2.6) appears in at least 14 of 121 core studies (11.6%). Second, reproducibility is near-absent (4 verified artifact releases among 121 core, 3.3%, a lower bound), and standards alignment outside the PQC stratum is mention-level only (12 of 121 core rows carry any standards signal, 9.9%). Third, real-time, update, and multi-agent-trust requirements are essentially unaddressed (1–2 papers each). Deep supervised learning leads the method mix (45 studies) over adversarial ML (40); Authentication/RFFI absorbs 69 of 121 core (57.0%).</w:t>
+        <w:t>Validation practice splits by kind: 16 of 30 threat studies demonstrate on testbeds or over the air, while simulation-only and standard-split evaluations carry much of the defense mass; closed-loop evaluation appears in 14 of 121 core studies (11.6%). Reproducibility is near-absent (4 verified artifact releases, 3.3%), and standards alignment outside the post-quantum stratum is mention-level only (9.9%). Real-time, update, and multi-agent-trust requirements are essentially unaddressed (1–2 papers each).</w:t>
       </w:r>
     </w:p>
     <w:p>
@@ -810,7 +811,7 @@
           <w:sz w:val="24"/>
           <w:szCs w:val="24"/>
         </w:rPr>
-        <w:t xml:space="preserve">Because classification was single-coder and 110 of 130 rows were coded from abstracts, cross-group readiness comparisons are indicative rather than measured effects: a documented reconciliation pass moved track-level R2 means by up to about 0.6 — more than several margins the corpus supports — and the readiness rubric’s standards tier is unexercised in this sample. The paper therefore frames its findings as descriptive, releases the classified dataset (dataset_papers.csv) so independent coders can check, correct, or extend it, distills six structural research gaps, and closes with a twelve-item reporting checklist (WIRELESS-AI-RC).</w:t>
+        <w:t>Because 110 of 130 rows were coded from abstracts by a single coder, cross-group comparisons are indicative rather than measured effects. The paper releases the classified dataset for independent checking, distills six structural research gaps, and closes with a twelve-item reporting checklist (WIRELESS-AI-RC).</w:t>
       </w:r>
     </w:p>
     <w:p>
@@ -827,7 +828,7 @@
           <w:sz w:val="24"/>
           <w:szCs w:val="24"/>
         </w:rPr>
-        <w:t xml:space="preserve">Keywords:</w:t>
+        <w:t>Keywords: wireless security; physical-layer authentication; RF fingerprinting; adversarial machine learning; physical-layer key generation; anti-jamming; post-quantum migration.</w:t>
       </w:r>
       <w:r>
         <w:rPr>
@@ -836,7 +837,6 @@
           <w:sz w:val="24"/>
           <w:szCs w:val="24"/>
         </w:rPr>
-        <w:t xml:space="preserve"> wireless security; physical-layer authentication; RF fingerprinting; adversarial machine learning; physical-layer key generation; anti-jamming; post-quantum migration; scoping review.</w:t>
       </w:r>
     </w:p>
     <w:p>
@@ -1757,7 +1757,7 @@
           <w:sz w:val="24"/>
           <w:szCs w:val="24"/>
         </w:rPr>
-        <w:t xml:space="preserve">Fig. 7 previews the analysis, mapping the corpus across security functions and method families: the field’s center of gravity sits squarely in the RFFI × (adversarial + deep-supervised) complex, key generation is a simulation-heavy island, and LLM-assisted work is only now appearing. The remainder of the paper is organized as follows. §2 details the review methodology. §3 presents the corpus overview and bibliometric analysis. §§4–6 review threats, defenses, and the quantum-era context. §7 examines cross-cutting directions. §8 formulates gaps and the checklist. §9 concludes.</w:t>
+        <w:t>Fig. 7 previews the analysis, mapping the corpus across security functions and method families: the field’s center of gravity sits squarely in the RFFI × (adversarial + deep-supervised) complex, key generation is a simulation-heavy island, and LLM-assisted work is only now appearing. The remainder of the paper is organised as follows. §2 details the review methodology. §3 presents the corpus overview and bibliometric analysis. §§4–6 review threats, defenses, and the quantum-era context. §7 examines cross-cutting directions. §8 formulates gaps and the checklist. §9 concludes.</w:t>
       </w:r>
     </w:p>
     <w:p>
@@ -1808,7 +1808,7 @@
           <w:sz w:val="24"/>
           <w:szCs w:val="24"/>
         </w:rPr>
-        <w:t xml:space="preserve">The objective is to characterize the state and evolution of AI applied to radio-link security broadly construed: authentication/RFFI (including localization-fingerprint attacks where geofence bypass breaks an authorization boundary), key generation/distribution/exchange/management, anti-jamming/secure communications, protocol/traffic/signal analysis where the classifier is the security boundary, side-channel analysis, federated privacy, and learned primitives — crossed with AI as attacker tool, defender tool, or learned primitive — over 2020-01-01–2026-10-11, plus readiness gaps for autonomous systems (drones, vehicles, swarms, IoT/edge). Post-quantum migration forms a separate contextual stratum (9 studies, several of which meet neither the AI-link nor the radio-link criterion on their own and are retained as context only), never pooled with AI claims. No in-corpus paper joins AI-driven attack with PQC implementation over a radio link; that join is recorded as a scoping result with the caveat that the stratum was assembled without an AI-linkage requirement, so its emptiness describes this corpus, not the field. The title question — is wireless security ready for the AI era? — is answered in §9: no, on current evidence.</w:t>
+        <w:t>The objective is to characterise the state and evolution of AI applied to radio-link security broadly construed: authentication/RFFI (including localisation-fingerprint attacks where geofence bypass breaks an authorisation boundary), key generation/distribution/exchange/management, anti-jamming/secure communications, protocol/traffic/signal analysis where the classifier is the security boundary, side-channel analysis, federated privacy, and learned primitives — crossed with AI as attacker tool, defender tool, or learned primitive — over 2020-01-01–2026-10-11, plus readiness gaps for autonomous systems (drones, vehicles, swarms, IoT/edge). Post-quantum migration forms a separate contextual stratum (9 studies, several of which meet neither the AI-link nor the radio-link criterion on their own and are retained as context only), never pooled with AI claims. No in-corpus paper joins AI-driven attack with PQC implementation over a radio link; that join is recorded as a scoping result with the caveat that the stratum was assembled without an AI-linkage requirement, so its emptiness describes this corpus, not the field. The title question — is wireless security ready for the AI era? — is answered in §9: no, on current evidence.</w:t>
       </w:r>
     </w:p>
     <w:p>
@@ -1978,7 +1978,7 @@
           <w:sz w:val="24"/>
           <w:szCs w:val="24"/>
         </w:rPr>
-        <w:t xml:space="preserve">Two deduplication adjudications deserve explicit documentation because they change N. Two same-team companion pairs are counted as distinct records with disclosure (D55/T15: TCCN authorization framework plus datasets vs GLOBECOM outlier-augmentation method — the arXiv preprint carries the GLOBECOM title and cites the TCCN paper as prior work, confirming distinct records; D20/T20: TVT UAV-PLA paper vs CPS-IoT Week encrypted-traffic paper); dropping either pair would move N to 129/128 without changing the headline patterns of §3.1. One same-team conference-to-journal extension was deduped (T02 subsumed by T03, which covers its FGSM/PGD results and adds black-box UAP). Two initially mis-keyed records were corrected against publisher metadata (D20 to its TVT paper, D55 to its TCCN paper).</w:t>
+        <w:t>Two deduplication adjudications deserve explicit documentation because they change N. Two same-team companion pairs are counted as distinct records with disclosure (D55/T15: TCCN authorisation framework plus datasets vs GLOBECOM outlier-augmentation method — the arXiv preprint carries the GLOBECOM title and cites the TCCN paper as prior work, confirming distinct records; D20/T20: TVT UAV-PLA paper vs CPS-IoT Week encrypted-traffic paper); dropping either pair would move N to 129/128 without changing the headline patterns of §3.1. One same-team conference-to-journal extension was deduped (T02 subsumed by T03, which covers its FGSM/PGD results and adds black-box UAP). Two initially mis-keyed records were corrected against publisher metadata (D20 to its TVT paper, D55 to its TCCN paper).</w:t>
       </w:r>
     </w:p>
     <w:p>
@@ -2056,7 +2056,7 @@
           <w:sz w:val="24"/>
           <w:szCs w:val="24"/>
         </w:rPr>
-        <w:t xml:space="preserve">Table 2 summarizes the criteria. Inclusion required: (i) radio-link/wireless population; (ii) security link (broad wireless-ML-security scope per §1: encryption, authentication including localization-fingerprint attacks where geofence bypass breaks an authorization boundary, key exchange/management/generation, physical-layer security, anti-jamming/secure communications, signal/traffic analysis where the classifier is the security boundary, side-channel analysis, federated privacy); (iii) AI involvement; (iv) dated 2020–2026, English, retrievable; (v) evaluable evidence (experiment, testbed, simulation, proof, cryptanalysis); (vi) peer-reviewed venue or reputable arXiv preprint (ID+version+access date; published supersedes; preprints ≤40% — observed 14.6%).</w:t>
+        <w:t>Table 2 summarises the criteria. Inclusion required: (i) radio-link/wireless population; (ii) security link (broad wireless-ML-security scope per §1: encryption, authentication including localisation-fingerprint attacks where geofence bypass breaks an authorisation boundary, key exchange/management/generation, physical-layer security, anti-jamming/secure communications, signal/traffic analysis where the classifier is the security boundary, side-channel analysis, federated privacy); (iii) AI involvement; (iv) dated 2020–2026, English, retrievable; (v) evaluable evidence (experiment, testbed, simulation, proof, cryptanalysis); (vi) peer-reviewed venue or reputable arXiv preprint (ID+version+access date; published supersedes; preprints ≤40% — observed 14.6%).</w:t>
       </w:r>
     </w:p>
     <w:p>
@@ -2071,7 +2071,7 @@
           <w:sz w:val="24"/>
           <w:szCs w:val="24"/>
         </w:rPr>
-        <w:t xml:space="preserve">Exclusion: not wireless; no security link; no AI link; survey/opinion without primary mechanism (background only); pre-2020; non-English; retracted; unretrievable; duplicate (§2.3 adjudications); no evaluable evidence; preprint without evaluation. Adjudications logged: domain-informed cellular fuzzing without ML content is excluded for failing AI involvement (T07, consistent with the T24 exclusion); Wi-Fi localization-fingerprint attacks count where geofence bypass breaks an authorization boundary (T42 included on that ground, not on a forgery-breaks-authentication claim); signal-classifier attacks count where the classifier is the security boundary (T44 included under D36/D37 precedent); IoT traffic-classifier attack-plus-defense counts as dual-track protocol work (T46 included); wireless-FL-privacy work counts where the privacy guarantee is produced by channel properties (over-the-air superposition, channel-noise differential privacy) — a physical-layer mechanism under the D24 precedent — while generic FL-application papers without a channel-produced guarantee are excluded; acoustic/vibration SCA on PQC fails the radio-link population (T45 excluded to related work); Wi-Fi sensing without security link moved to background (including T34); 5G regression-robustness work without a security boundary excluded (T35); Xplore-hosted rows counted as peer-reviewed (Xplore hosts only peer-reviewed content), venue reverified at full-text read; author-claimed venues without proceedings records coded preprint (D26, T05-preliminary, D46-submitted, D48, P09-accepted), while author claims confirmed by a publisher record stay peer-reviewed (D41 TVT proceedings record, D52 TCCN proceedings record, T28 USENIX proceedings).</w:t>
+        <w:t>Exclusion: not wireless; no security link; no AI link; survey/opinion without primary mechanism (background only); pre-2020; non-English; retracted; unretrievable; duplicate (§2.3 adjudications); no evaluable evidence; preprint without evaluation. Adjudications logged: domain-informed cellular fuzzing without ML content is excluded for failing AI involvement (T07, consistent with the T24 exclusion); Wi-Fi localisation-fingerprint attacks count where geofence bypass breaks an authorisation boundary (T42 included on that ground, not on a forgery-breaks-authentication claim); signal-classifier attacks count where the classifier is the security boundary (T44 included under D36/D37 precedent); IoT traffic-classifier attack-plus-defense counts as dual-track protocol work (T46 included); wireless-FL-privacy work counts where the privacy guarantee is produced by channel properties (over-the-air superposition, channel-noise differential privacy) — a physical-layer mechanism under the D24 precedent — while generic FL-application papers without a channel-produced guarantee are excluded; acoustic/vibration SCA on PQC fails the radio-link population (T45 excluded to related work); Wi-Fi sensing without security link moved to background (including T34); 5G regression-robustness work without a security boundary excluded (T35); Xplore-hosted rows counted as peer-reviewed (Xplore hosts only peer-reviewed content), venue reverified at full-text read; author-claimed venues without proceedings records coded preprint (D26, T05-preliminary, D46-submitted, D48, P09-accepted), while author claims confirmed by a publisher record stay peer-reviewed (D41 TVT proceedings record, D52 TCCN proceedings record, T28 USENIX proceedings).</w:t>
       </w:r>
     </w:p>
     <w:p>
@@ -2900,7 +2900,7 @@
           <w:sz w:val="24"/>
           <w:szCs w:val="24"/>
         </w:rPr>
-        <w:t xml:space="preserve">Each paper was classified along six fields: (1) security function (8 values: Authentication/RFFI, Key generation/distribution, Anti-jamming/secure comms, Protocol/traffic/cryptanalysis, PQC migration contextual, Federated/privacy-preserving FL, Learned primitives/crypto, Side-channel attack analysis); (2) AI method family (adversarial ML, deep supervised, PQC implementation, reinforcement/DRL, federated/private, traffic-analysis ML, LLM-assisted, defensive/robust ML, classical/Bayesian, optimization-based, dataset/benchmark, survey); (3) track (threat 30 / defense 84 / both 7 / pqc-context 9, with T05/T14 moved to dual-track under the develops-and-evaluates-both rule); (4) primary data source; (5) validation approach; (6) readiness R1–R5 with an explicit rubric — R1 (all): 0 absent / 1 implicit / 2 explicit attacker capability + assumptions; R2 (all): 0 theory/proof/analysis without data evaluation / 1 controlled evaluation (simulation, reused datasets or traces, cross-domain protocols on collected data) / 2 author-conducted OTA/testbed demonstration or demonstrated real key recovery — as applied, simulation-only rows score 1 per the protocol rubric (an earlier pass that had downgraded confirmed-simulation rows to 0 stands reversed and logged; the mapping is asserted programmatically over all 130 rows with one documented override (T01: Standard-split validation with R2=2 for demonstrated over-the-air key recovery — without it the threat mean would read 1.50); R4 (all): 0 neither / 1 code OR data / 2 both or artifact-evaluated; R3 defense/learned-crypto/auth: 0 no cost / 1 latency OR energy + HW target / 2 both + HW target; R5 defense/PQC-context: 0 none / 1 mentions 3GPP/IETF/NIST/ETSI / 2 evaluated against profile — each 0–2 (report medians/ranges per track; total = sum of applicable items only). Papers take a single dominant value per field; conservative coding throughout (abstract-level except where full-text reads are logged in fulltext_reads.md; 32 Unclear-source rows remain a stated limitation). R3 and R5 apply to attack papers whenever the abstract states an observable attacker-cost or standards signal: 6 attack rows carry R3 = 1 and 5 carry R5 = 1, and rows without such a statement score 0 (24 of 30 for R3, 25 of 30 for R5). Corpus-level counts (Table 5) include these values and per-track means report them (threat R3 0.20, R5 0.17); defense-side comparisons never pool attacker-side cost with defender-side cost.</w:t>
+        <w:t>Each paper was classified along six fields: (1) security function (8 values: Authentication/RFFI, Key generation/distribution, Anti-jamming/secure comms, Protocol/traffic/cryptanalysis, PQC migration contextual, Federated/privacy-preserving FL, Learned primitives/crypto, Side-channel attack analysis); (2) AI method family (adversarial ML, deep supervised, PQC implementation, reinforcement/DRL, federated/private, traffic-analysis ML, LLM-assisted, defensive/robust ML, classical/Bayesian, optimisation-based, dataset/benchmark, survey); (3) track (threat 30 / defense 84 / both 7 / pqc-context 9, with T05/T14 moved to dual-track under the develops-and-evaluates-both rule); (4) primary data source; (5) validation approach; (6) readiness R1–R5 with an explicit rubric — R1 (all): 0 absent / 1 implicit / 2 explicit attacker capability + assumptions; R2 (all): 0 theory/proof/analysis without data evaluation / 1 controlled evaluation (simulation, reused datasets or traces, cross-domain protocols on collected data) / 2 author-conducted OTA/testbed demonstration or demonstrated real key recovery — as applied, simulation-only rows score 1 per the protocol rubric (an earlier pass that had downgraded confirmed-simulation rows to 0 stands reversed and logged; the mapping is asserted programmatically over all 130 rows with one documented override (T01: Standard-split validation with R2=2 for demonstrated over-the-air key recovery — without it the threat mean would read 1.50); R4 (all): 0 neither / 1 code OR data / 2 both or artifact-evaluated; R3 defense/learned-crypto/auth: 0 no cost / 1 latency OR energy + HW target / 2 both + HW target; R5 defense/PQC-context: 0 none / 1 mentions 3GPP/IETF/NIST/ETSI / 2 evaluated against profile — each 0–2 (report medians/ranges per track; total = sum of applicable items only). Papers take a single dominant value per field; conservative coding throughout (abstract-level except where full-text reads are logged in fulltext_reads.md; 32 Unclear-source rows remain a stated limitation). R3 and R5 apply to attack papers whenever the abstract states an observable attacker-cost or standards signal: 6 attack rows carry R3 = 1 and 5 carry R5 = 1, and rows without such a statement score 0 (24 of 30 for R3, 25 of 30 for R5). Corpus-level counts (Table 5) include these values and per-track means report them (threat R3 0.20, R5 0.17); defense-side comparisons never pool attacker-side cost with defender-side cost.</w:t>
       </w:r>
     </w:p>
     <w:p>
@@ -2963,7 +2963,7 @@
           <w:sz w:val="24"/>
           <w:szCs w:val="24"/>
         </w:rPr>
-        <w:t xml:space="preserve">Quantitatively, classification fields are aggregated into cross-tabulations — function by year, method by year, data, validation, readiness per track — that characterize the corpus as a sample (§3); every figure and count was generated programmatically from the released dataset (see code/; check_consistency.py gates export on sums and caption n-values). One derived measure is used repeatedly and is defined here rather than later: </w:t>
+        <w:t>Quantitatively, classification fields are aggregated into cross-tabulations — function by year, method by year, data, validation, readiness per track — that characterise the corpus as a sample (§3); every figure and count was generated programmatically from the released dataset (see code/; check_consistency.py gates export on sums and caption n-values). One derived measure is used repeatedly and is defined here rather than later: closed-loop evaluation denotes dual-track studies plus any threat paper that evaluates against a stated defense and any defense paper that evaluates against a stated attack. It reaches at least 14 of 121 core (11.6%, a lower bound — abstract wording may hide further cases; a full-text audit is future work); the narrow dual-track-only count is 7 of 130 (5.4%), and both counts are reported wherever the number appears.</w:t>
       </w:r>
       <w:r>
         <w:rPr>
@@ -2974,7 +2974,6 @@
           <w:sz w:val="24"/>
           <w:szCs w:val="24"/>
         </w:rPr>
-        <w:t xml:space="preserve">closed-loop evaluation</w:t>
       </w:r>
       <w:r>
         <w:rPr>
@@ -2983,7 +2982,6 @@
           <w:sz w:val="24"/>
           <w:szCs w:val="24"/>
         </w:rPr>
-        <w:t xml:space="preserve"> denotes dual-track studies plus any threat paper that evaluates against a stated defense and any defense paper that evaluates against a stated attack. It reaches at least 14 of 121 core (11.6%, a lower bound — abstract wording may hide further cases; a full-text audit is future work); the narrow dual-track-only count is 7 of 130 (5.4%), and both counts are reported wherever the number appears.</w:t>
       </w:r>
     </w:p>
     <w:p>
@@ -3138,7 +3136,7 @@
           <w:sz w:val="24"/>
           <w:szCs w:val="24"/>
         </w:rPr>
-        <w:t xml:space="preserve">The corpus spans 2020–2026 with a rising but non-monotonic profile: 4 (2020), 17 (2021), 10 (2022), 21 (2023), 29 (2024), 36 (2025), 13 (2026 partial) (Figs. 3–4). The 2021 bump is substantially a coverage effect: 5 of the 7 rerun-added FL-privacy papers date to 2021, without which the year reads 12. Excluding those 7 as a sensitivity check (N=123): defense R2 reads 1.32 instead of 1.27 while threat R2 is unchanged at 1.53, and simulation-only reads 16 instead of 18 — the threat-realism lead, dual-track lowest realism, and RFFI dominance hold either way. Two caveats: the corpus is curated, so the curve partly reflects curation as well as field growth; and the preprint share concentrates in the partial 2026 window (8 of 13 papers, against 0–14% in 2020–2025), which is the velocity justification for their inclusion (§3.5). With those caveats, the profile matches the field’s post-2020 SDR-democratization and the 2024–2025 adversarial-ML surge. Sensitivity: dropping either duplicate-ID pair (D55/T15 or D20/T20) moves yearly totals by at most one paper and leaves the acceleration pattern unchanged.</w:t>
+        <w:t>The corpus spans 2020–2026 with a rising but non-monotonic profile: 4 (2020), 17 (2021), 10 (2022), 21 (2023), 29 (2024), 36 (2025), 13 (2026 partial) (Figs. 3–4). The 2021 bump is substantially a coverage effect: 5 of the 7 rerun-added FL-privacy papers date to 2021, without which the year reads 12. Excluding those 7 as a sensitivity check (N=123): defense R2 reads 1.32 instead of 1.27 while threat R2 is unchanged at 1.53, and simulation-only reads 16 instead of 18 — the threat-realism lead, dual-track lowest realism, and RFFI dominance hold either way. Two caveats: the corpus is curated, so the curve partly reflects curation as well as field growth; and the preprint share concentrates in the partial 2026 window (8 of 13 papers, against 0–14% in 2020–2025), which is the velocity justification for their inclusion (§3.5). With those caveats, the profile matches the field’s post-2020 SDR-democratisation and the 2024–2025 adversarial-ML surge. Sensitivity: dropping either duplicate-ID pair (D55/T15 or D20/T20) moves yearly totals by at most one paper and leaves the acceleration pattern unchanged.</w:t>
       </w:r>
     </w:p>
     <w:p>
@@ -3245,7 +3243,7 @@
           <w:sz w:val="24"/>
           <w:szCs w:val="24"/>
         </w:rPr>
-        <w:t xml:space="preserve">Deep supervised learning leads with 45 papers against 40 adversarial ML (Fig. 5, Table 3), a 5-paper margin that is not robust: the database-rerun merge added 4 deep-supervised RFFI papers while the dedupe cut removed two adversarial papers (T02 subsumed by T03; T35 excluded), and the federated-privacy additions sit in neither family. Deep supervised work led in every year through 2023 (2–1 in 2020 through 9–7 in 2023); the families then tie in 2024 (10–10) and again in 2025 (11–11, the corpus-wide peak for both), and the partial 2026 window stands 3–4 with adversarial ML narrowly ahead. Deep supervised totals 21 papers through end-2023, and only 33 of its 45 address RFFI, so “deep supervised fingerprinting” mislabels the family (remainder: key generation 8, side-channel 2, anti-jamming 1, protocol/traffic 1). Adversarial ML spans white-box, black-box UAP, GAN-spoofing, backdoors, and universal PHY perturbations, with the 2025–2026 wave adding self-supervised-target backdoors [T41], over-the-air Wi-Fi attacks [T42], and frequency-selective strikes [T44]. Reinforcement/DRL holds at 9, all defense-side (anti-jamming, UAV relay, secrecy-rate optimization). PQC implementation (9) concentrates 2024–2026. Federated/private learning climbs to 12 — nearly tripled by the rerun coverage correction, reported as such rather than as field growth — traffic-analysis ML (2), a single LLM-assisted fuzzer (ConSeT [T28], 2026), defensive/robust ML (2), dataset/benchmark contributions (2), survey/systematization (6), classical/Bayesian (1), and optimization-based (1) fill the long tail; protocol fuzzing/analysis leaves the taxonomy with T07’s exclusion. The sole classical/Bayesian paper sits under RFFI. The families are not mutually exclusive in practice; dominant-family coding understates mixing.</w:t>
+        <w:t>Deep supervised learning leads with 45 papers against 40 adversarial ML (Fig. 5, Table 3), a 5-paper margin that is not robust: the database-rerun merge added 4 deep-supervised RFFI papers while the dedupe cut removed two adversarial papers (T02 subsumed by T03; T35 excluded), and the federated-privacy additions sit in neither family. Deep supervised work led in every year through 2023 (2–1 in 2020 through 9–7 in 2023); the families then tie in 2024 (10–10) and again in 2025 (11–11, the corpus-wide peak for both), and the partial 2026 window stands 3–4 with adversarial ML narrowly ahead. Deep supervised totals 21 papers through end-2023, and only 33 of its 45 address RFFI, so “deep supervised fingerprinting” mislabels the family (remainder: key generation 8, side-channel 2, anti-jamming 1, protocol/traffic 1). Adversarial ML spans white-box, black-box UAP, GAN-spoofing, backdoors, and universal PHY perturbations, with the 2025–2026 wave adding self-supervised-target backdoors [T41], over-the-air Wi-Fi attacks [T42], and frequency-selective strikes [T44]. Reinforcement/DRL holds at 9, all defense-side (anti-jamming, UAV relay, secrecy-rate optimisation). PQC implementation (9) concentrates 2024–2026. Federated/private learning climbs to 12 — nearly tripled by the rerun coverage correction, reported as such rather than as field growth — traffic-analysis ML (2), a single LLM-assisted fuzzer (ConSeT [T28], 2026), defensive/robust ML (2), dataset/benchmark contributions (2), survey/systematisation (6), classical/Bayesian (1), and optimisation-based (1) fill the long tail; protocol fuzzing/analysis leaves the taxonomy with T07’s exclusion. The sole classical/Bayesian paper sits under RFFI. The families are not mutually exclusive in practice; dominant-family coding understates mixing.</w:t>
       </w:r>
     </w:p>
     <w:p>
@@ -5259,7 +5257,7 @@
           <w:sz w:val="24"/>
           <w:szCs w:val="24"/>
         </w:rPr>
-        <w:t xml:space="preserve">Three observations qualify this trajectory. First, the families overlap in practice and dominant-family coding understates method mixing. Second, the adversarial rise is partly a response to the recognized brittleness of fingerprint classifiers under domain shift — but attack papers are, on average, evaluated no more stringently against adaptive defenses than defense papers are against adaptive attacks (§4), and no cited threat paper exploits domain shift as a standalone vector (T40 documents consistent cross-device misclassification under domain shift and demonstrates its use as a backdoor for system intrusion on real-world experiments — attack surface with a demonstrated trigger, not a deployed exploit). Third, the LLM-assisted cluster is too small to represent a trend; its significance is that LLM-based baseband analysis is appearing at all.</w:t>
+        <w:t>Three observations qualify this trajectory. First, the families overlap in practice and dominant-family coding understates method mixing. Second, the adversarial rise is partly a response to the recognised brittleness of fingerprint classifiers under domain shift — but attack papers are, on average, evaluated no more stringently against adaptive defenses than defense papers are against adaptive attacks (§4), and no cited threat paper exploits domain shift as a standalone vector (T40 documents consistent cross-device misclassification under domain shift and demonstrates its use as a backdoor for system intrusion on real-world experiments — attack surface with a demonstrated trigger, not a deployed exploit). Third, the LLM-assisted cluster is too small to represent a trend; its significance is that LLM-based baseband analysis is appearing at all.</w:t>
       </w:r>
     </w:p>
     <w:p>
@@ -8552,7 +8550,7 @@
           <w:sz w:val="24"/>
           <w:szCs w:val="24"/>
         </w:rPr>
-        <w:t xml:space="preserve">Data sources: Testbed/OTA measurement 46, Collected datasets/traces 26, Simulation 20, Analysis/benchmark 6, Unclear from abstract 32 (Fig. 8, left; Table 7; data-source field, not validation). Validation: Testbed/field demonstration 47 (36%), Cross-domain/generalization 26 (20%), Simulation-only 18 (14%), Standard split/unclear 35, Benchmark/analysis 4 (right panel). Crossing validation with track substantiates the section’s descriptive headline (Fig. 9): among threat papers (n=30), 16 are testbed/field demonstrations, 9 standard splits, 2 cross-domain, 2 simulation-only, 1 benchmark — measured plurality, not norm, with 6 threat data-sources unclear from abstract; key generation carries the simulation-only mass (7 of 12 keygen papers simulation-only; defense sim-only 16 of 84 — Table 9).</w:t>
+        <w:t>Data sources: Testbed/OTA measurement 46, Collected datasets/traces 26, Simulation 20, Analysis/benchmark 6, Unclear from abstract 32 (Fig. 8, left; Table 7; data-source field, not validation). Validation: Testbed/field demonstration 47 (36%), Cross-domain/generalisation 26 (20%), Simulation-only 18 (14%), Standard split/unclear 35, Benchmark/analysis 4 (right panel). Crossing validation with track substantiates the section’s descriptive headline (Fig. 9): among threat papers (n=30), 16 are testbed/field demonstrations, 9 standard splits, 2 cross-domain, 2 simulation-only, 1 benchmark — measured plurality, not norm, with 6 threat data-sources unclear from abstract; key generation carries the simulation-only mass (7 of 12 keygen papers simulation-only; defense sim-only 16 of 84 — Table 9).</w:t>
       </w:r>
     </w:p>
     <w:p>
@@ -15904,7 +15902,7 @@
           <w:sz w:val="24"/>
           <w:szCs w:val="24"/>
         </w:rPr>
-        <w:t xml:space="preserve">RFF/PLA defenses chase domain shift: contrastive embeddings, receiver-agnostic training, open-set/few-shot enrollment, cross-receiver calibration [D75], multi-distance generalization [D73], domain-adaptive features [D72], satellite fingerprinting [D71], proactive authentication — accuracy under shift, rarely under attack. Key generation defenses improve KDR/KGR mostly in simulation, with a 2026 channel-informed neural scheme [D74] grounding features in over-the-air channel soundings. DRL anti-jamming optimizes relay/power/secrecy-rate without onboard-cost reporting. Federated privacy demonstrates differentially private OTA aggregation at small scale.</w:t>
+        <w:t>RFF/PLA defenses chase domain shift: contrastive embeddings, receiver-agnostic training, open-set/few-shot enrollment, cross-receiver calibration [D75], multi-distance generalisation [D73], domain-adaptive features [D72], satellite fingerprinting [D71], proactive authentication — accuracy under shift, rarely under attack. Key generation defenses improve KDR/KGR mostly in simulation, with a 2026 channel-informed neural scheme [D74] grounding features in over-the-air channel soundings. DRL anti-jamming optimises relay/power/secrecy-rate without onboard-cost reporting. Federated privacy demonstrates differentially private OTA aggregation at small scale.</w:t>
       </w:r>
     </w:p>
     <w:p>
@@ -17093,7 +17091,7 @@
           <w:sz w:val="24"/>
           <w:szCs w:val="24"/>
         </w:rPr>
-        <w:t xml:space="preserve">Function × validation cross-tabulations are descriptive (no significance tests; metric heterogeneity forbids pooling). The field optimizes estimators while adversaries optimize exploitability — a mismatch no single-function advance can fix. A venue-community check does not explain the asymmetry away: stratifying R2 by security venues (NDSS, CCS, USENIX, TIFS, WiseML and kin) versus comms and other venues, comms-venue threats outscore comms-venue defenses on realism (means 1.61 vs 1.31, n=23/68), while security-venue papers score lower in both tracks (threat 1.29, n=7 — T01, T19, T20, T23, T28, T30, T39, of which T01, T28 and T30 score 2 and the analysis/workshop remainder scores 0–1; defense 1.12, n=16) — small-n and caution-worthy, but running against the community-norms confound rather than with it. Fig. 13 stacks the corpus by layer to make the coverage gap visible: the signal layer is contested, the link layer half-defended, the protocol layer thinly covered, and the system layer essentially absent.</w:t>
+        <w:t>Function × validation cross-tabulations are descriptive (no significance tests; metric heterogeneity forbids pooling). The field optimises estimators while adversaries optimise exploitability — a mismatch no single-function advance can fix. A venue-community check does not explain the asymmetry away: stratifying R2 by security venues (NDSS, CCS, USENIX, TIFS, WiseML and kin) versus comms and other venues, comms-venue threats outscore comms-venue defenses on realism (means 1.61 vs 1.31, n=23/68), while security-venue papers score lower in both tracks (threat 1.29, n=7 — T01, T19, T20, T23, T28, T30, T39, of which T01, T28 and T30 score 2 and the analysis/workshop remainder scores 0–1; defense 1.12, n=16) — small-n and caution-worthy, but running against the community-norms confound rather than with it. Fig. 13 stacks the corpus by layer to make the coverage gap visible: the signal layer is contested, the link layer half-defended, the protocol layer thinly covered, and the system layer essentially absent.</w:t>
       </w:r>
     </w:p>
     <w:p>
@@ -17158,7 +17156,7 @@
           <w:sz w:val="21"/>
           <w:szCs w:val="21"/>
         </w:rPr>
-        <w:t xml:space="preserve">Figure 13: </w:t>
+        <w:t>Figure 13: Layered attack surface versus demonstrated defense coverage, synthesised from the corpus (conceptual). Coverage thins with every step up the stack.</w:t>
       </w:r>
       <w:r>
         <w:rPr>
@@ -17167,7 +17165,6 @@
           <w:sz w:val="21"/>
           <w:szCs w:val="21"/>
         </w:rPr>
-        <w:t xml:space="preserve">Layered attack surface versus demonstrated defense coverage, synthesized from the corpus (conceptual). Coverage thins with every step up the stack.</w:t>
       </w:r>
     </w:p>
     <w:p>
@@ -17274,7 +17271,7 @@
           <w:sz w:val="24"/>
           <w:szCs w:val="24"/>
         </w:rPr>
-        <w:t xml:space="preserve">Cross-referencing the bibliometric analysis of §3 with the function-level reviews of §§4–7 yields six structural gaps, summarized in Table 13 and operationalized into the concrete reporting checklist in Table 14. The ordering is deliberate: the first three rows concern how the field evaluates and shares evidence, the fourth how it reports cost, and the last two where the evidence stops short of deployment needs. None of the six requires a new method family, and all are measurable against the released dataset — a rerun of this review in two years should be able to score each row as narrowed, unchanged, or widened. The checklist is the review’s most actionable artifact: the minimum metadata a study must disclose for its claims to be comparable, reproducible, and poolable in future syntheses. Each item corresponds to a practice whose absence the corpus analysis showed to be distorting — undisclosed splits, unnamed datasets, or unquantified compute.</w:t>
+        <w:t>Cross-referencing the bibliometric analysis of §3 with the function-level reviews of §§4–7 yields six structural gaps, summarised in Table 13 and operationalised into the concrete reporting checklist in Table 14. The ordering is deliberate: the first three rows concern how the field evaluates and shares evidence, the fourth how it reports cost, and the last two where the evidence stops short of deployment needs. None of the six requires a new method family, and all are measurable against the released dataset — a rerun of this review in two years should be able to score each row as narrowed, unchanged, or widened. The checklist is the review’s most actionable artifact: the minimum metadata a study must disclose for its claims to be comparable, reproducible, and poolable in future syntheses. Each item corresponds to a practice whose absence the corpus analysis showed to be distorting — undisclosed splits, unnamed datasets, or unquantified compute.</w:t>
       </w:r>
     </w:p>
     <w:p>
@@ -20963,7 +20960,7 @@
           <w:sz w:val="24"/>
           <w:szCs w:val="24"/>
         </w:rPr>
-        <w:t xml:space="preserve">Funding.</w:t>
+        <w:t>Funding. No specific funding for this work. Conflicts. None declared. Author contributions. Hussain Touhid Siddiquee (correspondence: touhidsiddiqueeraj@gmail.com) performed 100% title/abstract screening, full-text eligibility review, charting, coding, formal analysis, and drafting; Md. Abul Malek Fahim independently reviewed and validated the coding decisions and all derived results, and both authors are in agreement with the reported findings; two independent verifiers performed corrective verification checks on a 22-record sample. Both authors read and approved the submitted manuscript. Data availability. The classified corpus (dataset_papers.csv), screening log, retrieval records, and analysis scripts accompany this submission as supplementary material and are openly available in the public research archive at https://github.com/touhidsiddiqueeraj-bit/Is-Wireless-Security-Ready-for-the-AI-Era-. Code availability. Coding and figure-generation scripts are included in the supplementary archive and rerun from the released dataset; check_consistency.py gates export. Ethics. Not applicable. AI use. AI assistance was limited to candidate pooling, prose drafting, and copy-editing; no screening, coding, counting, or verification decision was delegated to AI, and all counts were computed programmatically from the released dataset under human control (first-author coding; second-author validation; independent verifier sample; no blind κ claimed). Every record carries a resolvable identifier verified against Crossref, arXiv, ACM, or USENIX; no identifier was fabricated or shared. The authors take full responsibility for the content.</w:t>
       </w:r>
       <w:r>
         <w:rPr>
@@ -20972,7 +20969,6 @@
           <w:sz w:val="24"/>
           <w:szCs w:val="24"/>
         </w:rPr>
-        <w:t xml:space="preserve"> No specific funding for this work. </w:t>
       </w:r>
       <w:r>
         <w:rPr>
@@ -20983,7 +20979,6 @@
           <w:sz w:val="24"/>
           <w:szCs w:val="24"/>
         </w:rPr>
-        <w:t xml:space="preserve">Conflicts.</w:t>
       </w:r>
       <w:r>
         <w:rPr>
@@ -20992,7 +20987,6 @@
           <w:sz w:val="24"/>
           <w:szCs w:val="24"/>
         </w:rPr>
-        <w:t xml:space="preserve"> None declared. </w:t>
       </w:r>
       <w:r>
         <w:rPr>
@@ -21003,7 +20997,6 @@
           <w:sz w:val="24"/>
           <w:szCs w:val="24"/>
         </w:rPr>
-        <w:t xml:space="preserve">Author contributions.</w:t>
       </w:r>
       <w:r>
         <w:rPr>
@@ -21012,7 +21005,6 @@
           <w:sz w:val="24"/>
           <w:szCs w:val="24"/>
         </w:rPr>
-        <w:t xml:space="preserve"> Hussain Touhid Siddiquee (correspondence: touhidsiddiqueeraj@gmail.com) performed 100% title/abstract screening, full-text eligibility review, charting, coding, formal analysis, and drafting; Md. Abul Malek Fahim independently reviewed and validated the coding decisions and all derived results, and both authors are in agreement with the reported findings; two independent verifiers performed corrective verification checks on a 22-record sample. Both authors read and approved the submitted manuscript. </w:t>
       </w:r>
       <w:r>
         <w:rPr>
@@ -21023,7 +21015,6 @@
           <w:sz w:val="24"/>
           <w:szCs w:val="24"/>
         </w:rPr>
-        <w:t xml:space="preserve">Data availability.</w:t>
       </w:r>
       <w:r>
         <w:rPr>
@@ -21032,7 +21023,6 @@
           <w:sz w:val="24"/>
           <w:szCs w:val="24"/>
         </w:rPr>
-        <w:t xml:space="preserve"> The classified corpus (dataset_papers.csv), screening log, retrieval records, and analysis scripts accompany this submission as an anonymized supplementary archive (mirrored on an anonymized hosting service for review); a public repository will be named only upon acceptance. </w:t>
       </w:r>
       <w:r>
         <w:rPr>
@@ -21043,7 +21033,6 @@
           <w:sz w:val="24"/>
           <w:szCs w:val="24"/>
         </w:rPr>
-        <w:t xml:space="preserve">Code availability.</w:t>
       </w:r>
       <w:r>
         <w:rPr>
@@ -21052,7 +21041,6 @@
           <w:sz w:val="24"/>
           <w:szCs w:val="24"/>
         </w:rPr>
-        <w:t xml:space="preserve"> Coding and figure-generation scripts are included in the supplementary archive and rerun from the released dataset; check_consistency.py gates export. </w:t>
       </w:r>
       <w:r>
         <w:rPr>
@@ -21063,7 +21051,6 @@
           <w:sz w:val="24"/>
           <w:szCs w:val="24"/>
         </w:rPr>
-        <w:t xml:space="preserve">Ethics.</w:t>
       </w:r>
       <w:r>
         <w:rPr>
@@ -21072,7 +21059,6 @@
           <w:sz w:val="24"/>
           <w:szCs w:val="24"/>
         </w:rPr>
-        <w:t xml:space="preserve"> Not applicable. </w:t>
       </w:r>
       <w:r>
         <w:rPr>
@@ -21083,7 +21069,6 @@
           <w:sz w:val="24"/>
           <w:szCs w:val="24"/>
         </w:rPr>
-        <w:t xml:space="preserve">AI use.</w:t>
       </w:r>
       <w:r>
         <w:rPr>
@@ -21092,7 +21077,6 @@
           <w:sz w:val="24"/>
           <w:szCs w:val="24"/>
         </w:rPr>
-        <w:t xml:space="preserve"> AI assistance was limited to candidate pooling, prose drafting, and copy-editing; no screening, coding, counting, or verification decision was delegated to AI, and all counts were computed programmatically from the released dataset under human control (first-author coding; second-author validation; independent verifier sample; no blind κ claimed). Every record carries a resolvable identifier verified against Crossref, arXiv, ACM, or USENIX; no identifier was fabricated or shared. The authors take full responsibility for the content.</w:t>
       </w:r>
     </w:p>
     <w:p>
@@ -25044,6 +25028,26 @@
         <w:szCs w:val="21"/>
       </w:rPr>
       <w:t xml:space="preserve"> -</w:t>
+    </w:r>
+  </w:p>
+</w:ftr>
+</file>
+
+<file path=word/footer2.xml><?xml version="1.0" encoding="utf-8"?>
+<w:ftr xmlns:m="http://schemas.openxmlformats.org/officeDocument/2006/math" xmlns:mc="http://schemas.openxmlformats.org/markup-compatibility/2006" xmlns:mo="http://schemas.microsoft.com/office/mac/office/2008/main" xmlns:mv="urn:schemas-microsoft-com:mac:vml" xmlns:o="urn:schemas-microsoft-com:office:office" xmlns:r="http://schemas.openxmlformats.org/officeDocument/2006/relationships" xmlns:v="urn:schemas-microsoft-com:vml" xmlns:w10="urn:schemas-microsoft-com:office:word" xmlns:w14="http://schemas.microsoft.com/office/word/2010/wordml" xmlns:w="http://schemas.openxmlformats.org/wordprocessingml/2006/main" xmlns:wne="http://schemas.microsoft.com/office/word/2006/wordml" xmlns:wp14="http://schemas.microsoft.com/office/word/2010/wordprocessingDrawing" xmlns:wp="http://schemas.openxmlformats.org/drawingml/2006/wordprocessingDrawing" xmlns:wpc="http://schemas.microsoft.com/office/word/2010/wordprocessingCanvas" xmlns:wpg="http://schemas.microsoft.com/office/word/2010/wordprocessingGroup" xmlns:wpi="http://schemas.microsoft.com/office/word/2010/wordprocessingInk" xmlns:wps="http://schemas.microsoft.com/office/word/2010/wordprocessingShape" mc:Ignorable="w14 wp14">
+  <w:p>
+    <w:pPr>
+      <w:pStyle w:val="Footer"/>
+      <w:jc w:val="right"/>
+    </w:pPr>
+    <w:r>
+      <w:fldChar w:fldCharType="begin"/>
+    </w:r>
+    <w:r>
+      <w:instrText xml:space="preserve">PAGE</w:instrText>
+    </w:r>
+    <w:r>
+      <w:fldChar w:fldCharType="end"/>
     </w:r>
   </w:p>
 </w:ftr>

</xml_diff>